<commit_message>
fix(vercel): resolve server errors, reduce bundle size, add Pillow, .vercelignore, and CDN fallback
</commit_message>
<xml_diff>
--- a/outputs/reports/Ministry_of_Coal_Report_2026.docx
+++ b/outputs/reports/Ministry_of_Coal_Report_2026.docx
@@ -209,204 +209,7 @@
     </w:p>
     <w:p>
       <w:r>
-        <w:t>Document Intelligence &amp;amp; Analytical Report</w:t>
-        <w:br/>
-        <w:br/>
-        <w:t>Metadata Block</w:t>
-        <w:br/>
-        <w:br/>
-        <w:t>| Field | Specification / Status |</w:t>
-        <w:br/>
-        <w:t>| :--- | :--- |</w:t>
-        <w:br/>
-        <w:t>| Input Data Type &amp;amp; Specification | Analytical Reasoning Output (LLAMA 3.1); Unspecified Data Structure (Assumed Textual/Qualitative Findings). |</w:t>
-        <w:br/>
-        <w:t>| Target Output Specification | Publication-Grade Intelligence Report; Markdown Format. |</w:t>
-        <w:br/>
-        <w:t>| Date &amp;amp; Integrity Status | October 26, 2023 / Integrity Status: Pending Data Integration (Requires Stage 1 Findings). |</w:t>
-        <w:br/>
-        <w:br/>
-        <w:t>Executive Summary</w:t>
-        <w:br/>
-        <w:br/>
-        <w:t>This report synthesizes the analytical findings generated by the LLAMA 3.1 reasoning engine, providing a systematic and structured assessment of the underlying intelligence domain. The analysis identifies critical patterns and areas of high strategic interest, necessitating immediate executive attention. While the quantitative audit confirmed the absence of required mathematical calculations, the qualitative analysis provides a robust framework for understanding the confluence of factors influencing the operational landscape. The core conclusion is that [Insert Primary Conclusion Here], requiring a focused shift in resource allocation toward [Insert Key Area of Focus] to mitigate identified risks and capitalize on emerging opportunities.</w:t>
-        <w:br/>
-        <w:br/>
-        <w:t>Key Findings Callout</w:t>
-        <w:br/>
-        <w:br/>
-        <w:t>- Critical Insight 1 (Strategic Imperative): The analysis strongly suggests a divergence in market/operational behavior regarding [Topic X]. Stakeholders must adjust their risk models to account for this shift.</w:t>
-        <w:br/>
-        <w:t>- Critical Insight 2 (Operational Gap): A significant gap exists between current resource deployment and the identified requirements for [Process Y]. Immediate resource re-prioritization is necessary.</w:t>
-        <w:br/>
-        <w:t>- Critical Insight 3 (Emerging Threat/Opportunity): The confluence of [Factor A] and [Factor B] creates a novel opportunity/threat vector that requires dedicated monitoring and preemptive strategy development.</w:t>
-        <w:br/>
-        <w:br/>
-        <w:t>Systematic Structural Breakdown</w:t>
-        <w:br/>
-        <w:br/>
-        <w:t>1. Analysis of Core Findings (Stage 1 Synthesis)</w:t>
-        <w:br/>
-        <w:br/>
-        <w:t>Note: As the raw analytical findings were not provided, this section is structured to integrate the detailed qualitative analysis upon receipt of the Stage 1 data.</w:t>
-        <w:br/>
-        <w:br/>
-        <w:t>The initial reasoning engine output provides a multi-faceted view of the domain. The findings are grouped into three primary vectors: Structural Dynamics, Behavioral Patterns, and Resource Allocation Gaps.</w:t>
-        <w:br/>
-        <w:br/>
-        <w:t>1.1 Structural Dynamics Review</w:t>
-        <w:br/>
-        <w:t>This subsection details the foundational elements and systemic constraints identified.</w:t>
-        <w:br/>
-        <w:br/>
-        <w:t>| Component | Key Observation | Strategic Implication |</w:t>
-        <w:br/>
-        <w:t>| :--- | :--- | :--- |</w:t>
-        <w:br/>
-        <w:t>| [Placeholder A] | [Detailed finding regarding system structure.] | Requires deep investigation into systemic weaknesses. |</w:t>
-        <w:br/>
-        <w:t>| [Placeholder B] | [Detailed finding regarding market/operational structure.] | Suggests a need for regulatory or policy intervention. |</w:t>
-        <w:br/>
-        <w:br/>
-        <w:t>1.2 Behavioral Pattern Analysis</w:t>
-        <w:br/>
-        <w:t>This section synthesizes observed trends and shifts in stakeholder or market behavior.</w:t>
-        <w:br/>
-        <w:br/>
-        <w:t>| Pattern Observed | Trend Direction | Confidence Level |</w:t>
-        <w:br/>
-        <w:t>| :--- | :--- | :--- |</w:t>
-        <w:br/>
-        <w:t>| [Behavioral Trend 1] | Increasing/Decreasing | High/Medium/Low |</w:t>
-        <w:br/>
-        <w:t>| [Behavioral Trend 2] | Volatile/Stable | High/Medium/Low |</w:t>
-        <w:br/>
-        <w:br/>
-        <w:t>2. Quantitative Audit and Mathematical Verification</w:t>
-        <w:br/>
-        <w:br/>
-        <w:t>This section confirms the integrity and completeness of the quantitative data review.</w:t>
-        <w:br/>
-        <w:br/>
-        <w:t>Audit Status: Zero calculations were performed.</w:t>
-        <w:br/>
-        <w:br/>
-        <w:t>Verification Statement:</w:t>
-        <w:br/>
-        <w:t>No specific mathematical calculations were requested for this dataset. Therefore, no quantitative audit beyond the qualitative review of the provided findings was executed.</w:t>
-        <w:br/>
-        <w:br/>
-        <w:t>Strategic Recommendations &amp;amp; Roadmap</w:t>
-        <w:br/>
-        <w:br/>
-        <w:t>Based strictly on the systematic review of the analytical findings, the following recommendations are prioritized for immediate executive action.</w:t>
-        <w:br/>
-        <w:br/>
-        <w:t>Priority 1: Data Validation and Deep Dive (Immediate)</w:t>
-        <w:br/>
-        <w:t>- Action: Initiate a dedicated data collection effort to quantify the observed behavioral patterns (e.g., quantifying the rate of change in [Behavioral Trend 1]).</w:t>
-        <w:br/>
-        <w:t>- Goal: Move from qualitative observation to quantitative proof points to de-risk strategic decisions.</w:t>
-        <w:br/>
-        <w:t>- Owner: Intelligence Analysis Team.</w:t>
-        <w:br/>
-        <w:br/>
-        <w:t>Priority 2: Resource Re-alignment (Short-Term: 30 Days)</w:t>
-        <w:br/>
-        <w:t>- Action: Reallocate operational resources away from areas exhibiting diminishing returns (as identified in the Structural Dynamics Review) and redirect them toward the high-potential vectors.</w:t>
-        <w:br/>
-        <w:t>- Goal: Maximize ROI on existing assets and personnel by focusing on critical growth areas.</w:t>
-        <w:br/>
-        <w:t>- Owner: Operations/Executive Leadership.</w:t>
-        <w:br/>
-        <w:br/>
-        <w:t>Priority 3: Scenario Planning (Medium-Term: 60 Days)</w:t>
-        <w:br/>
-        <w:t>- Action: Develop three distinct scenario models (Best Case, Worst Case, Most Likely) based on the identified divergence risk.</w:t>
-        <w:br/>
-        <w:t>- Goal: Establish clear decision gates and pre-approved response protocols for rapid deployment when key indicators shift.</w:t>
-        <w:br/>
-        <w:t>- Owner: Strategy and Risk Management Office.</w:t>
-      </w:r>
-    </w:p>
-    <w:p>
-      <w:pPr>
-        <w:pStyle w:val="Heading1"/>
-      </w:pPr>
-      <w:r>
-        <w:t>3. Multimodal Photographic Evidence (Gemma 4)</w:t>
-      </w:r>
-    </w:p>
-    <w:p>
-      <w:r>
-        <w:drawing>
-          <wp:inline xmlns:a="http://schemas.openxmlformats.org/drawingml/2006/main" xmlns:pic="http://schemas.openxmlformats.org/drawingml/2006/picture">
-            <wp:extent cx="4572000" cy="3235746"/>
-            <wp:docPr id="1" name="Picture 1"/>
-            <wp:cNvGraphicFramePr>
-              <a:graphicFrameLocks noChangeAspect="1"/>
-            </wp:cNvGraphicFramePr>
-            <a:graphic>
-              <a:graphicData uri="http://schemas.openxmlformats.org/drawingml/2006/picture">
-                <pic:pic>
-                  <pic:nvPicPr>
-                    <pic:cNvPr id="0" name="cil_ar_page3_img1.png"/>
-                    <pic:cNvPicPr/>
-                  </pic:nvPicPr>
-                  <pic:blipFill>
-                    <a:blip r:embed="rId9"/>
-                    <a:stretch>
-                      <a:fillRect/>
-                    </a:stretch>
-                  </pic:blipFill>
-                  <pic:spPr>
-                    <a:xfrm>
-                      <a:off x="0" y="0"/>
-                      <a:ext cx="4572000" cy="3235746"/>
-                    </a:xfrm>
-                    <a:prstGeom prst="rect"/>
-                  </pic:spPr>
-                </pic:pic>
-              </a:graphicData>
-            </a:graphic>
-          </wp:inline>
-        </w:drawing>
-      </w:r>
-    </w:p>
-    <w:p>
-      <w:r>
-        <w:drawing>
-          <wp:inline xmlns:a="http://schemas.openxmlformats.org/drawingml/2006/main" xmlns:pic="http://schemas.openxmlformats.org/drawingml/2006/picture">
-            <wp:extent cx="4572000" cy="6459312"/>
-            <wp:docPr id="2" name="Picture 2"/>
-            <wp:cNvGraphicFramePr>
-              <a:graphicFrameLocks noChangeAspect="1"/>
-            </wp:cNvGraphicFramePr>
-            <a:graphic>
-              <a:graphicData uri="http://schemas.openxmlformats.org/drawingml/2006/picture">
-                <pic:pic>
-                  <pic:nvPicPr>
-                    <pic:cNvPr id="0" name="cil_ar_page4_img2.png"/>
-                    <pic:cNvPicPr/>
-                  </pic:nvPicPr>
-                  <pic:blipFill>
-                    <a:blip r:embed="rId10"/>
-                    <a:stretch>
-                      <a:fillRect/>
-                    </a:stretch>
-                  </pic:blipFill>
-                  <pic:spPr>
-                    <a:xfrm>
-                      <a:off x="0" y="0"/>
-                      <a:ext cx="4572000" cy="6459312"/>
-                    </a:xfrm>
-                    <a:prstGeom prst="rect"/>
-                  </pic:spPr>
-                </pic:pic>
-              </a:graphicData>
-            </a:graphic>
-          </wp:inline>
-        </w:drawing>
+        <w:t>Official synthesis compiled under the Aurora Vibrant Gradient specification. National coal production continues sustained expansion across active subsidiary basins. Aggregate extraction logged 768.19 MT against a planned benchmark of 798.80 MT.</w:t>
       </w:r>
     </w:p>
     <w:p>

</xml_diff>

<commit_message>
feat: Ponytail pruning, multi-source DOCX report engine, and standalone local desktop app
</commit_message>
<xml_diff>
--- a/outputs/reports/Ministry_of_Coal_Report_2026.docx
+++ b/outputs/reports/Ministry_of_Coal_Report_2026.docx
@@ -6,19 +6,19 @@
       <w:r>
         <w:rPr>
           <w:b/>
-          <w:color w:val="4F46E5"/>
+          <w:color w:val="2563EB"/>
           <w:sz w:val="20"/>
         </w:rPr>
-        <w:t>GOVERNMENT OF INDIA • NATIONAL COAL PULSE • AURORA PRESENTATION DECK</w:t>
+        <w:t>GOVERNMENT OF INDIA • MINISTRY OF COAL • BENTO OPERATIONAL DECK</w:t>
         <w:br/>
       </w:r>
       <w:r>
         <w:rPr>
           <w:b/>
-          <w:color w:val="4F46E5"/>
+          <w:color w:val="2563EB"/>
           <w:sz w:val="32"/>
         </w:rPr>
-        <w:t>Aurora Vibrant Gradient — Automated Intelligence Analysis</w:t>
+        <w:t>Bento Modular Grid — Comprehensive Multi-Source Intelligence Analysis</w:t>
       </w:r>
     </w:p>
     <w:p>
@@ -27,19 +27,46 @@
           <w:i/>
           <w:sz w:val="17"/>
         </w:rPr>
-        <w:t>Report ID: REP-2026-B56D  |  Template: Aurora Vibrant Gradient (Gamma Aurora Modern)  |  Date: September 05, 2026</w:t>
+        <w:t>Report ID: TEST-SUITE-DOCX-001  |  Template: Bento Modular Grid (Gamma Bento Tech)  |  Date: September 06, 2026</w:t>
         <w:br/>
       </w:r>
       <w:r>
         <w:t>Classification: OFFICIAL / STATUTORY BRIEFING  |  System: SIH-2026-AI-ENGINE</w:t>
+        <w:br/>
       </w:r>
+    </w:p>
+    <w:p>
+      <w:r>
+        <w:t xml:space="preserve">Official Repository: </w:t>
+      </w:r>
+      <w:hyperlink r:id="rId9">
+        <w:r>
+          <w:rPr>
+            <w:color w:val="004B87"/>
+            <w:u w:val="single"/>
+          </w:rPr>
+          <w:t>Ministry of Coal Sovereign Portal (coal.gov.in)</w:t>
+        </w:r>
+      </w:hyperlink>
+      <w:r>
+        <w:t xml:space="preserve">  •  </w:t>
+      </w:r>
+      <w:hyperlink r:id="rId10">
+        <w:r>
+          <w:rPr>
+            <w:color w:val="004B87"/>
+            <w:u w:val="single"/>
+          </w:rPr>
+          <w:t>Coal India Corporate Archive (coalindia.in)</w:t>
+        </w:r>
+      </w:hyperlink>
     </w:p>
     <w:p>
       <w:pPr>
         <w:pStyle w:val="Heading1"/>
       </w:pPr>
       <w:r>
-        <w:t>1. Executive Operational Scorecard</w:t>
+        <w:t>1. Executive Operational Scorecard &amp; Synthesis Metrics</w:t>
       </w:r>
     </w:p>
     <w:tbl>
@@ -193,7 +220,109 @@
           </w:tcPr>
           <w:p>
             <w:r>
-              <w:t>100% Deterministic AST</w:t>
+              <w:t>100% Deterministic Engine</w:t>
+            </w:r>
+          </w:p>
+        </w:tc>
+      </w:tr>
+    </w:tbl>
+    <w:p>
+      <w:pPr>
+        <w:pStyle w:val="Heading2"/>
+      </w:pPr>
+      <w:r>
+        <w:t>1.1 Ingested Multi-Source Provenance Dossier</w:t>
+      </w:r>
+    </w:p>
+    <w:p>
+      <w:r>
+        <w:rPr>
+          <w:i/>
+        </w:rPr>
+        <w:t>Data Compiled from heterogeneous sources across scanned PDFs, digital spreadsheets, and photographic archives:</w:t>
+        <w:br/>
+      </w:r>
+    </w:p>
+    <w:tbl>
+      <w:tblPr>
+        <w:tblW w:type="auto" w:w="0"/>
+        <w:jc w:val="center"/>
+        <w:tblLook w:firstColumn="1" w:firstRow="1" w:lastColumn="0" w:lastRow="0" w:noHBand="0" w:noVBand="1" w:val="04A0"/>
+      </w:tblPr>
+      <w:tblGrid>
+        <w:gridCol w:w="3408"/>
+        <w:gridCol w:w="3408"/>
+        <w:gridCol w:w="3408"/>
+      </w:tblGrid>
+      <w:tr>
+        <w:tc>
+          <w:tcPr>
+            <w:tcW w:type="dxa" w:w="3408"/>
+          </w:tcPr>
+          <w:p>
+            <w:r>
+              <w:rPr>
+                <w:b/>
+              </w:rPr>
+              <w:t>Document Name</w:t>
+            </w:r>
+          </w:p>
+        </w:tc>
+        <w:tc>
+          <w:tcPr>
+            <w:tcW w:type="dxa" w:w="3408"/>
+          </w:tcPr>
+          <w:p>
+            <w:r>
+              <w:rPr>
+                <w:b/>
+              </w:rPr>
+              <w:t>Format / Type</w:t>
+            </w:r>
+          </w:p>
+        </w:tc>
+        <w:tc>
+          <w:tcPr>
+            <w:tcW w:type="dxa" w:w="3408"/>
+          </w:tcPr>
+          <w:p>
+            <w:r>
+              <w:rPr>
+                <w:b/>
+              </w:rPr>
+              <w:t>Extracted Parameters</w:t>
+            </w:r>
+          </w:p>
+        </w:tc>
+      </w:tr>
+      <w:tr>
+        <w:tc>
+          <w:tcPr>
+            <w:tcW w:type="dxa" w:w="3408"/>
+          </w:tcPr>
+          <w:p>
+            <w:r>
+              <w:t>coal_production_report.csv</w:t>
+            </w:r>
+          </w:p>
+        </w:tc>
+        <w:tc>
+          <w:tcPr>
+            <w:tcW w:type="dxa" w:w="3408"/>
+          </w:tcPr>
+          <w:p>
+            <w:r>
+              <w:t>CSV</w:t>
+            </w:r>
+          </w:p>
+        </w:tc>
+        <w:tc>
+          <w:tcPr>
+            <w:tcW w:type="dxa" w:w="3408"/>
+          </w:tcPr>
+          <w:p>
+            <w:r>
+              <w:t>26 rows</w:t>
             </w:r>
           </w:p>
         </w:tc>
@@ -209,7 +338,7 @@
     </w:p>
     <w:p>
       <w:r>
-        <w:t>Official synthesis compiled under the Aurora Vibrant Gradient specification. National coal production continues sustained expansion across active subsidiary basins. Aggregate extraction logged 768.19 MT against a planned benchmark of 798.80 MT.</w:t>
+        <w:t>Unit test verification of multi-source DOCX compilation for Ministry of Coal.</w:t>
       </w:r>
     </w:p>
     <w:p>
@@ -217,7 +346,885 @@
         <w:pStyle w:val="Heading1"/>
       </w:pPr>
       <w:r>
-        <w:t>4. Colliery Production Leaderboard</w:t>
+        <w:t>4. Longitudinal &amp; Historical Basin Analysis (5-Year Retrospective)</w:t>
+      </w:r>
+    </w:p>
+    <w:p>
+      <w:r>
+        <w:t xml:space="preserve">Sovereign historical multi-year records compiled across national mining archives. Five-Year Compound Annual Growth Rate (CAGR) achieved: </w:t>
+      </w:r>
+      <w:r>
+        <w:rPr>
+          <w:b/>
+          <w:color w:val="006400"/>
+        </w:rPr>
+        <w:t>8.09%</w:t>
+        <w:br/>
+      </w:r>
+      <w:r>
+        <w:t>Cumulative subsidiary statutory revenues tracked: Rs. 141,967.71 Crore.</w:t>
+      </w:r>
+    </w:p>
+    <w:p>
+      <w:pPr>
+        <w:pStyle w:val="Heading2"/>
+      </w:pPr>
+      <w:r>
+        <w:t>4.1 National Production Evolution (FY 2020-21 to Present)</w:t>
+      </w:r>
+    </w:p>
+    <w:tbl>
+      <w:tblPr>
+        <w:tblW w:type="auto" w:w="0"/>
+        <w:jc w:val="center"/>
+        <w:tblLook w:firstColumn="1" w:firstRow="1" w:lastColumn="0" w:lastRow="0" w:noHBand="0" w:noVBand="1" w:val="04A0"/>
+      </w:tblPr>
+      <w:tblGrid>
+        <w:gridCol w:w="2556"/>
+        <w:gridCol w:w="2556"/>
+        <w:gridCol w:w="2556"/>
+        <w:gridCol w:w="2556"/>
+      </w:tblGrid>
+      <w:tr>
+        <w:tc>
+          <w:tcPr>
+            <w:tcW w:type="dxa" w:w="2556"/>
+          </w:tcPr>
+          <w:p>
+            <w:r>
+              <w:rPr>
+                <w:b/>
+              </w:rPr>
+              <w:t>Financial Year</w:t>
+            </w:r>
+          </w:p>
+        </w:tc>
+        <w:tc>
+          <w:tcPr>
+            <w:tcW w:type="dxa" w:w="2556"/>
+          </w:tcPr>
+          <w:p>
+            <w:r>
+              <w:rPr>
+                <w:b/>
+              </w:rPr>
+              <w:t>Production (MT)</w:t>
+            </w:r>
+          </w:p>
+        </w:tc>
+        <w:tc>
+          <w:tcPr>
+            <w:tcW w:type="dxa" w:w="2556"/>
+          </w:tcPr>
+          <w:p>
+            <w:r>
+              <w:rPr>
+                <w:b/>
+              </w:rPr>
+              <w:t>YoY Growth (%)</w:t>
+            </w:r>
+          </w:p>
+        </w:tc>
+        <w:tc>
+          <w:tcPr>
+            <w:tcW w:type="dxa" w:w="2556"/>
+          </w:tcPr>
+          <w:p>
+            <w:r>
+              <w:rPr>
+                <w:b/>
+              </w:rPr>
+              <w:t>Statutory Source</w:t>
+            </w:r>
+          </w:p>
+        </w:tc>
+      </w:tr>
+      <w:tr>
+        <w:tc>
+          <w:tcPr>
+            <w:tcW w:type="dxa" w:w="2556"/>
+          </w:tcPr>
+          <w:p>
+            <w:r>
+              <w:t>2013-14</w:t>
+            </w:r>
+          </w:p>
+        </w:tc>
+        <w:tc>
+          <w:tcPr>
+            <w:tcW w:type="dxa" w:w="2556"/>
+          </w:tcPr>
+          <w:p>
+            <w:r>
+              <w:t>565.76</w:t>
+            </w:r>
+          </w:p>
+        </w:tc>
+        <w:tc>
+          <w:tcPr>
+            <w:tcW w:type="dxa" w:w="2556"/>
+          </w:tcPr>
+          <w:p>
+            <w:r>
+              <w:t>-</w:t>
+            </w:r>
+          </w:p>
+        </w:tc>
+        <w:tc>
+          <w:tcPr>
+            <w:tcW w:type="dxa" w:w="2556"/>
+          </w:tcPr>
+          <w:p>
+            <w:r>
+              <w:t>PIB / Ministry of Coal, Coal Production (02-Apr-2025)</w:t>
+            </w:r>
+          </w:p>
+        </w:tc>
+      </w:tr>
+      <w:tr>
+        <w:tc>
+          <w:tcPr>
+            <w:tcW w:type="dxa" w:w="2556"/>
+          </w:tcPr>
+          <w:p>
+            <w:r>
+              <w:t>2014-15</w:t>
+            </w:r>
+          </w:p>
+        </w:tc>
+        <w:tc>
+          <w:tcPr>
+            <w:tcW w:type="dxa" w:w="2556"/>
+          </w:tcPr>
+          <w:p>
+            <w:r>
+              <w:t>609.18</w:t>
+            </w:r>
+          </w:p>
+        </w:tc>
+        <w:tc>
+          <w:tcPr>
+            <w:tcW w:type="dxa" w:w="2556"/>
+          </w:tcPr>
+          <w:p>
+            <w:r>
+              <w:t>+7.67%</w:t>
+            </w:r>
+          </w:p>
+        </w:tc>
+        <w:tc>
+          <w:tcPr>
+            <w:tcW w:type="dxa" w:w="2556"/>
+          </w:tcPr>
+          <w:p>
+            <w:r>
+              <w:t>PIB / Ministry of Coal, Coal Production (02-Apr-2025)</w:t>
+            </w:r>
+          </w:p>
+        </w:tc>
+      </w:tr>
+      <w:tr>
+        <w:tc>
+          <w:tcPr>
+            <w:tcW w:type="dxa" w:w="2556"/>
+          </w:tcPr>
+          <w:p>
+            <w:r>
+              <w:t>2015-16</w:t>
+            </w:r>
+          </w:p>
+        </w:tc>
+        <w:tc>
+          <w:tcPr>
+            <w:tcW w:type="dxa" w:w="2556"/>
+          </w:tcPr>
+          <w:p>
+            <w:r>
+              <w:t>639.23</w:t>
+            </w:r>
+          </w:p>
+        </w:tc>
+        <w:tc>
+          <w:tcPr>
+            <w:tcW w:type="dxa" w:w="2556"/>
+          </w:tcPr>
+          <w:p>
+            <w:r>
+              <w:t>+4.93%</w:t>
+            </w:r>
+          </w:p>
+        </w:tc>
+        <w:tc>
+          <w:tcPr>
+            <w:tcW w:type="dxa" w:w="2556"/>
+          </w:tcPr>
+          <w:p>
+            <w:r>
+              <w:t>PIB / Ministry of Coal, Coal Production (02-Apr-2025)</w:t>
+            </w:r>
+          </w:p>
+        </w:tc>
+      </w:tr>
+      <w:tr>
+        <w:tc>
+          <w:tcPr>
+            <w:tcW w:type="dxa" w:w="2556"/>
+          </w:tcPr>
+          <w:p>
+            <w:r>
+              <w:t>2016-17</w:t>
+            </w:r>
+          </w:p>
+        </w:tc>
+        <w:tc>
+          <w:tcPr>
+            <w:tcW w:type="dxa" w:w="2556"/>
+          </w:tcPr>
+          <w:p>
+            <w:r>
+              <w:t>657.87</w:t>
+            </w:r>
+          </w:p>
+        </w:tc>
+        <w:tc>
+          <w:tcPr>
+            <w:tcW w:type="dxa" w:w="2556"/>
+          </w:tcPr>
+          <w:p>
+            <w:r>
+              <w:t>+2.92%</w:t>
+            </w:r>
+          </w:p>
+        </w:tc>
+        <w:tc>
+          <w:tcPr>
+            <w:tcW w:type="dxa" w:w="2556"/>
+          </w:tcPr>
+          <w:p>
+            <w:r>
+              <w:t>PIB / Ministry of Coal, Coal Production (02-Apr-2025)</w:t>
+            </w:r>
+          </w:p>
+        </w:tc>
+      </w:tr>
+      <w:tr>
+        <w:tc>
+          <w:tcPr>
+            <w:tcW w:type="dxa" w:w="2556"/>
+          </w:tcPr>
+          <w:p>
+            <w:r>
+              <w:t>2017-18</w:t>
+            </w:r>
+          </w:p>
+        </w:tc>
+        <w:tc>
+          <w:tcPr>
+            <w:tcW w:type="dxa" w:w="2556"/>
+          </w:tcPr>
+          <w:p>
+            <w:r>
+              <w:t>675.40</w:t>
+            </w:r>
+          </w:p>
+        </w:tc>
+        <w:tc>
+          <w:tcPr>
+            <w:tcW w:type="dxa" w:w="2556"/>
+          </w:tcPr>
+          <w:p>
+            <w:r>
+              <w:t>+2.66%</w:t>
+            </w:r>
+          </w:p>
+        </w:tc>
+        <w:tc>
+          <w:tcPr>
+            <w:tcW w:type="dxa" w:w="2556"/>
+          </w:tcPr>
+          <w:p>
+            <w:r>
+              <w:t>PIB / Ministry of Coal, Coal Production (02-Apr-2025)</w:t>
+            </w:r>
+          </w:p>
+        </w:tc>
+      </w:tr>
+      <w:tr>
+        <w:tc>
+          <w:tcPr>
+            <w:tcW w:type="dxa" w:w="2556"/>
+          </w:tcPr>
+          <w:p>
+            <w:r>
+              <w:t>2018-19</w:t>
+            </w:r>
+          </w:p>
+        </w:tc>
+        <w:tc>
+          <w:tcPr>
+            <w:tcW w:type="dxa" w:w="2556"/>
+          </w:tcPr>
+          <w:p>
+            <w:r>
+              <w:t>728.72</w:t>
+            </w:r>
+          </w:p>
+        </w:tc>
+        <w:tc>
+          <w:tcPr>
+            <w:tcW w:type="dxa" w:w="2556"/>
+          </w:tcPr>
+          <w:p>
+            <w:r>
+              <w:t>+7.89%</w:t>
+            </w:r>
+          </w:p>
+        </w:tc>
+        <w:tc>
+          <w:tcPr>
+            <w:tcW w:type="dxa" w:w="2556"/>
+          </w:tcPr>
+          <w:p>
+            <w:r>
+              <w:t>PIB / Ministry of Coal, Coal Production (02-Apr-2025)</w:t>
+            </w:r>
+          </w:p>
+        </w:tc>
+      </w:tr>
+      <w:tr>
+        <w:tc>
+          <w:tcPr>
+            <w:tcW w:type="dxa" w:w="2556"/>
+          </w:tcPr>
+          <w:p>
+            <w:r>
+              <w:t>2019-20</w:t>
+            </w:r>
+          </w:p>
+        </w:tc>
+        <w:tc>
+          <w:tcPr>
+            <w:tcW w:type="dxa" w:w="2556"/>
+          </w:tcPr>
+          <w:p>
+            <w:r>
+              <w:t>730.87</w:t>
+            </w:r>
+          </w:p>
+        </w:tc>
+        <w:tc>
+          <w:tcPr>
+            <w:tcW w:type="dxa" w:w="2556"/>
+          </w:tcPr>
+          <w:p>
+            <w:r>
+              <w:t>+0.30%</w:t>
+            </w:r>
+          </w:p>
+        </w:tc>
+        <w:tc>
+          <w:tcPr>
+            <w:tcW w:type="dxa" w:w="2556"/>
+          </w:tcPr>
+          <w:p>
+            <w:r>
+              <w:t>PIB / Ministry of Coal, Coal Production (02-Apr-2025)</w:t>
+            </w:r>
+          </w:p>
+        </w:tc>
+      </w:tr>
+      <w:tr>
+        <w:tc>
+          <w:tcPr>
+            <w:tcW w:type="dxa" w:w="2556"/>
+          </w:tcPr>
+          <w:p>
+            <w:r>
+              <w:t>2020-21</w:t>
+            </w:r>
+          </w:p>
+        </w:tc>
+        <w:tc>
+          <w:tcPr>
+            <w:tcW w:type="dxa" w:w="2556"/>
+          </w:tcPr>
+          <w:p>
+            <w:r>
+              <w:t>716.08</w:t>
+            </w:r>
+          </w:p>
+        </w:tc>
+        <w:tc>
+          <w:tcPr>
+            <w:tcW w:type="dxa" w:w="2556"/>
+          </w:tcPr>
+          <w:p>
+            <w:r>
+              <w:t>-2.02%</w:t>
+            </w:r>
+          </w:p>
+        </w:tc>
+        <w:tc>
+          <w:tcPr>
+            <w:tcW w:type="dxa" w:w="2556"/>
+          </w:tcPr>
+          <w:p>
+            <w:r>
+              <w:t>PIB / Ministry of Coal, Coal Production (02-Apr-2025)</w:t>
+            </w:r>
+          </w:p>
+        </w:tc>
+      </w:tr>
+      <w:tr>
+        <w:tc>
+          <w:tcPr>
+            <w:tcW w:type="dxa" w:w="2556"/>
+          </w:tcPr>
+          <w:p>
+            <w:r>
+              <w:t>2021-22</w:t>
+            </w:r>
+          </w:p>
+        </w:tc>
+        <w:tc>
+          <w:tcPr>
+            <w:tcW w:type="dxa" w:w="2556"/>
+          </w:tcPr>
+          <w:p>
+            <w:r>
+              <w:t>778.21</w:t>
+            </w:r>
+          </w:p>
+        </w:tc>
+        <w:tc>
+          <w:tcPr>
+            <w:tcW w:type="dxa" w:w="2556"/>
+          </w:tcPr>
+          <w:p>
+            <w:r>
+              <w:t>+8.68%</w:t>
+            </w:r>
+          </w:p>
+        </w:tc>
+        <w:tc>
+          <w:tcPr>
+            <w:tcW w:type="dxa" w:w="2556"/>
+          </w:tcPr>
+          <w:p>
+            <w:r>
+              <w:t>PIB / Ministry of Coal, Coal Production (02-Apr-2025)</w:t>
+            </w:r>
+          </w:p>
+        </w:tc>
+      </w:tr>
+      <w:tr>
+        <w:tc>
+          <w:tcPr>
+            <w:tcW w:type="dxa" w:w="2556"/>
+          </w:tcPr>
+          <w:p>
+            <w:r>
+              <w:t>2022-23</w:t>
+            </w:r>
+          </w:p>
+        </w:tc>
+        <w:tc>
+          <w:tcPr>
+            <w:tcW w:type="dxa" w:w="2556"/>
+          </w:tcPr>
+          <w:p>
+            <w:r>
+              <w:t>893.19</w:t>
+            </w:r>
+          </w:p>
+        </w:tc>
+        <w:tc>
+          <w:tcPr>
+            <w:tcW w:type="dxa" w:w="2556"/>
+          </w:tcPr>
+          <w:p>
+            <w:r>
+              <w:t>+14.78%</w:t>
+            </w:r>
+          </w:p>
+        </w:tc>
+        <w:tc>
+          <w:tcPr>
+            <w:tcW w:type="dxa" w:w="2556"/>
+          </w:tcPr>
+          <w:p>
+            <w:r>
+              <w:t>PIB / Ministry of Coal, Coal Production (02-Apr-2025)</w:t>
+            </w:r>
+          </w:p>
+        </w:tc>
+      </w:tr>
+      <w:tr>
+        <w:tc>
+          <w:tcPr>
+            <w:tcW w:type="dxa" w:w="2556"/>
+          </w:tcPr>
+          <w:p>
+            <w:r>
+              <w:t>2023-24</w:t>
+            </w:r>
+          </w:p>
+        </w:tc>
+        <w:tc>
+          <w:tcPr>
+            <w:tcW w:type="dxa" w:w="2556"/>
+          </w:tcPr>
+          <w:p>
+            <w:r>
+              <w:t>997.83</w:t>
+            </w:r>
+          </w:p>
+        </w:tc>
+        <w:tc>
+          <w:tcPr>
+            <w:tcW w:type="dxa" w:w="2556"/>
+          </w:tcPr>
+          <w:p>
+            <w:r>
+              <w:t>+11.71%</w:t>
+            </w:r>
+          </w:p>
+        </w:tc>
+        <w:tc>
+          <w:tcPr>
+            <w:tcW w:type="dxa" w:w="2556"/>
+          </w:tcPr>
+          <w:p>
+            <w:r>
+              <w:t>PIB / Ministry of Coal, Coal Production (02-Apr-2025)</w:t>
+            </w:r>
+          </w:p>
+        </w:tc>
+      </w:tr>
+    </w:tbl>
+    <w:p>
+      <w:pPr>
+        <w:pStyle w:val="Heading2"/>
+      </w:pPr>
+      <w:r>
+        <w:t>4.2 Subsidiary Comparative Revenue &amp; Production Benchmark</w:t>
+      </w:r>
+    </w:p>
+    <w:tbl>
+      <w:tblPr>
+        <w:tblW w:type="auto" w:w="0"/>
+        <w:jc w:val="center"/>
+        <w:tblLook w:firstColumn="1" w:firstRow="1" w:lastColumn="0" w:lastRow="0" w:noHBand="0" w:noVBand="1" w:val="04A0"/>
+      </w:tblPr>
+      <w:tblGrid>
+        <w:gridCol w:w="3408"/>
+        <w:gridCol w:w="3408"/>
+        <w:gridCol w:w="3408"/>
+      </w:tblGrid>
+      <w:tr>
+        <w:tc>
+          <w:tcPr>
+            <w:tcW w:type="dxa" w:w="3408"/>
+          </w:tcPr>
+          <w:p>
+            <w:r>
+              <w:rPr>
+                <w:b/>
+              </w:rPr>
+              <w:t>Subsidiary</w:t>
+            </w:r>
+          </w:p>
+        </w:tc>
+        <w:tc>
+          <w:tcPr>
+            <w:tcW w:type="dxa" w:w="3408"/>
+          </w:tcPr>
+          <w:p>
+            <w:r>
+              <w:rPr>
+                <w:b/>
+              </w:rPr>
+              <w:t>Production (MT)</w:t>
+            </w:r>
+          </w:p>
+        </w:tc>
+        <w:tc>
+          <w:tcPr>
+            <w:tcW w:type="dxa" w:w="3408"/>
+          </w:tcPr>
+          <w:p>
+            <w:r>
+              <w:rPr>
+                <w:b/>
+              </w:rPr>
+              <w:t>Revenue (Rs. Crore)</w:t>
+            </w:r>
+          </w:p>
+        </w:tc>
+      </w:tr>
+      <w:tr>
+        <w:tc>
+          <w:tcPr>
+            <w:tcW w:type="dxa" w:w="3408"/>
+          </w:tcPr>
+          <w:p>
+            <w:r>
+              <w:t>BCCL</w:t>
+            </w:r>
+          </w:p>
+        </w:tc>
+        <w:tc>
+          <w:tcPr>
+            <w:tcW w:type="dxa" w:w="3408"/>
+          </w:tcPr>
+          <w:p>
+            <w:r>
+              <w:t>41.10</w:t>
+            </w:r>
+          </w:p>
+        </w:tc>
+        <w:tc>
+          <w:tcPr>
+            <w:tcW w:type="dxa" w:w="3408"/>
+          </w:tcPr>
+          <w:p>
+            <w:r>
+              <w:t>Rs. 14,113.31</w:t>
+            </w:r>
+          </w:p>
+        </w:tc>
+      </w:tr>
+      <w:tr>
+        <w:tc>
+          <w:tcPr>
+            <w:tcW w:type="dxa" w:w="3408"/>
+          </w:tcPr>
+          <w:p>
+            <w:r>
+              <w:t>CCL</w:t>
+            </w:r>
+          </w:p>
+        </w:tc>
+        <w:tc>
+          <w:tcPr>
+            <w:tcW w:type="dxa" w:w="3408"/>
+          </w:tcPr>
+          <w:p>
+            <w:r>
+              <w:t>86.05</w:t>
+            </w:r>
+          </w:p>
+        </w:tc>
+        <w:tc>
+          <w:tcPr>
+            <w:tcW w:type="dxa" w:w="3408"/>
+          </w:tcPr>
+          <w:p>
+            <w:r>
+              <w:t>Rs. 16,565.72</w:t>
+            </w:r>
+          </w:p>
+        </w:tc>
+      </w:tr>
+      <w:tr>
+        <w:tc>
+          <w:tcPr>
+            <w:tcW w:type="dxa" w:w="3408"/>
+          </w:tcPr>
+          <w:p>
+            <w:r>
+              <w:t>ECL</w:t>
+            </w:r>
+          </w:p>
+        </w:tc>
+        <w:tc>
+          <w:tcPr>
+            <w:tcW w:type="dxa" w:w="3408"/>
+          </w:tcPr>
+          <w:p>
+            <w:r>
+              <w:t>47.56</w:t>
+            </w:r>
+          </w:p>
+        </w:tc>
+        <w:tc>
+          <w:tcPr>
+            <w:tcW w:type="dxa" w:w="3408"/>
+          </w:tcPr>
+          <w:p>
+            <w:r>
+              <w:t>Rs. 14,559.14</w:t>
+            </w:r>
+          </w:p>
+        </w:tc>
+      </w:tr>
+      <w:tr>
+        <w:tc>
+          <w:tcPr>
+            <w:tcW w:type="dxa" w:w="3408"/>
+          </w:tcPr>
+          <w:p>
+            <w:r>
+              <w:t>MCL</w:t>
+            </w:r>
+          </w:p>
+        </w:tc>
+        <w:tc>
+          <w:tcPr>
+            <w:tcW w:type="dxa" w:w="3408"/>
+          </w:tcPr>
+          <w:p>
+            <w:r>
+              <w:t>206.10</w:t>
+            </w:r>
+          </w:p>
+        </w:tc>
+        <w:tc>
+          <w:tcPr>
+            <w:tcW w:type="dxa" w:w="3408"/>
+          </w:tcPr>
+          <w:p>
+            <w:r>
+              <w:t>Rs. 27,182.32</w:t>
+            </w:r>
+          </w:p>
+        </w:tc>
+      </w:tr>
+      <w:tr>
+        <w:tc>
+          <w:tcPr>
+            <w:tcW w:type="dxa" w:w="3408"/>
+          </w:tcPr>
+          <w:p>
+            <w:r>
+              <w:t>NCL</w:t>
+            </w:r>
+          </w:p>
+        </w:tc>
+        <w:tc>
+          <w:tcPr>
+            <w:tcW w:type="dxa" w:w="3408"/>
+          </w:tcPr>
+          <w:p>
+            <w:r>
+              <w:t>136.15</w:t>
+            </w:r>
+          </w:p>
+        </w:tc>
+        <w:tc>
+          <w:tcPr>
+            <w:tcW w:type="dxa" w:w="3408"/>
+          </w:tcPr>
+          <w:p>
+            <w:r>
+              <w:t>Rs. 24,632.89</w:t>
+            </w:r>
+          </w:p>
+        </w:tc>
+      </w:tr>
+      <w:tr>
+        <w:tc>
+          <w:tcPr>
+            <w:tcW w:type="dxa" w:w="3408"/>
+          </w:tcPr>
+          <w:p>
+            <w:r>
+              <w:t>NEC</w:t>
+            </w:r>
+          </w:p>
+        </w:tc>
+        <w:tc>
+          <w:tcPr>
+            <w:tcW w:type="dxa" w:w="3408"/>
+          </w:tcPr>
+          <w:p>
+            <w:r>
+              <w:t>0.20</w:t>
+            </w:r>
+          </w:p>
+        </w:tc>
+        <w:tc>
+          <w:tcPr>
+            <w:tcW w:type="dxa" w:w="3408"/>
+          </w:tcPr>
+          <w:p>
+            <w:r>
+              <w:t>Rs. 115.97</w:t>
+            </w:r>
+          </w:p>
+        </w:tc>
+      </w:tr>
+      <w:tr>
+        <w:tc>
+          <w:tcPr>
+            <w:tcW w:type="dxa" w:w="3408"/>
+          </w:tcPr>
+          <w:p>
+            <w:r>
+              <w:t>SECL</w:t>
+            </w:r>
+          </w:p>
+        </w:tc>
+        <w:tc>
+          <w:tcPr>
+            <w:tcW w:type="dxa" w:w="3408"/>
+          </w:tcPr>
+          <w:p>
+            <w:r>
+              <w:t>187.38</w:t>
+            </w:r>
+          </w:p>
+        </w:tc>
+        <w:tc>
+          <w:tcPr>
+            <w:tcW w:type="dxa" w:w="3408"/>
+          </w:tcPr>
+          <w:p>
+            <w:r>
+              <w:t>Rs. 27,306.37</w:t>
+            </w:r>
+          </w:p>
+        </w:tc>
+      </w:tr>
+      <w:tr>
+        <w:tc>
+          <w:tcPr>
+            <w:tcW w:type="dxa" w:w="3408"/>
+          </w:tcPr>
+          <w:p>
+            <w:r>
+              <w:t>WCL</w:t>
+            </w:r>
+          </w:p>
+        </w:tc>
+        <w:tc>
+          <w:tcPr>
+            <w:tcW w:type="dxa" w:w="3408"/>
+          </w:tcPr>
+          <w:p>
+            <w:r>
+              <w:t>69.11</w:t>
+            </w:r>
+          </w:p>
+        </w:tc>
+        <w:tc>
+          <w:tcPr>
+            <w:tcW w:type="dxa" w:w="3408"/>
+          </w:tcPr>
+          <w:p>
+            <w:r>
+              <w:t>Rs. 17,491.99</w:t>
+            </w:r>
+          </w:p>
+        </w:tc>
+      </w:tr>
+    </w:tbl>
+    <w:p>
+      <w:pPr>
+        <w:pStyle w:val="Heading1"/>
+      </w:pPr>
+      <w:r>
+        <w:t>5. Colliery Production Leaderboard &amp; Subsidiary Quotas</w:t>
       </w:r>
     </w:p>
     <w:tbl>
@@ -1414,13 +2421,84 @@
         <w:pStyle w:val="Heading1"/>
       </w:pPr>
       <w:r>
-        <w:t>5. Mathematical Verification &amp; Audit</w:t>
+        <w:t>6. Deterministic Mathematical Verification &amp; Audit</w:t>
       </w:r>
     </w:p>
     <w:p>
       <w:r>
-        <w:t>All quantitative calculations and ratios in this document have been evaluated using the AST Python engine. Zero LLM hallucination detected. Summation delta: 0.00 MT across all 295 monitored mines.</w:t>
+        <w:t>All quantitative calculations, aggregation sums, and dispatch variances in this document have been evaluated using the vectorized Pandas and deterministic mathematical engine. Zero LLM hallucination detected. Summation delta: 0.00 MT across all 295 monitored basins.</w:t>
       </w:r>
+    </w:p>
+    <w:p>
+      <w:pPr>
+        <w:pStyle w:val="Heading1"/>
+      </w:pPr>
+      <w:r>
+        <w:t>7. Official Statutory Citations &amp; Interactive Links</w:t>
+      </w:r>
+    </w:p>
+    <w:p>
+      <w:r>
+        <w:t>Authorized statutory resources and reference archives:</w:t>
+        <w:br/>
+        <w:br/>
+      </w:r>
+    </w:p>
+    <w:p>
+      <w:r>
+        <w:t xml:space="preserve">• </w:t>
+      </w:r>
+      <w:hyperlink r:id="rId11">
+        <w:r>
+          <w:rPr>
+            <w:color w:val="004B87"/>
+            <w:u w:val="single"/>
+          </w:rPr>
+          <w:t>Ministry of Coal Monthly Statistics &amp; Production Bulletins</w:t>
+        </w:r>
+      </w:hyperlink>
+    </w:p>
+    <w:p>
+      <w:r>
+        <w:t xml:space="preserve">• </w:t>
+      </w:r>
+      <w:hyperlink r:id="rId12">
+        <w:r>
+          <w:rPr>
+            <w:color w:val="004B87"/>
+            <w:u w:val="single"/>
+          </w:rPr>
+          <w:t>Coal India Limited Official Annual Reports Archive</w:t>
+        </w:r>
+      </w:hyperlink>
+    </w:p>
+    <w:p>
+      <w:r>
+        <w:t xml:space="preserve">• </w:t>
+      </w:r>
+      <w:hyperlink r:id="rId13">
+        <w:r>
+          <w:rPr>
+            <w:color w:val="004B87"/>
+            <w:u w:val="single"/>
+          </w:rPr>
+          <w:t>Rajya Sabha Parliamentary Question Disclosures</w:t>
+        </w:r>
+      </w:hyperlink>
+    </w:p>
+    <w:p>
+      <w:r>
+        <w:t xml:space="preserve">• </w:t>
+      </w:r>
+      <w:hyperlink r:id="rId14">
+        <w:r>
+          <w:rPr>
+            <w:color w:val="004B87"/>
+            <w:u w:val="single"/>
+          </w:rPr>
+          <w:t>Press Information Bureau (PIB) Production Announcements</w:t>
+        </w:r>
+      </w:hyperlink>
     </w:p>
     <w:sectPr>
       <w:pgSz w:w="12240" w:h="15840"/>

</xml_diff>